<commit_message>
started on analysis script for random wiring simulations
</commit_message>
<xml_diff>
--- a/data/random_wiring/analysis/overall_survival/report_overall_survival.docx
+++ b/data/random_wiring/analysis/overall_survival/report_overall_survival.docx
@@ -4,15 +4,17 @@
   <w:body>
     <w:p>
       <w:pPr>
-        <w:jc w:val="center"/>
+        <w:pStyle w:val="Title"/>
       </w:pPr>
       <w:r>
-        <w:rPr>
-          <w:b/>
-          <w:sz w:val="36"/>
-        </w:rPr>
         <w:t>Analysis Report: Random Wiring Variants</w:t>
-        <w:br/>
+      </w:r>
+    </w:p>
+    <w:p>
+      <w:pPr>
+        <w:pStyle w:val="Heading1"/>
+      </w:pPr>
+      <w:r>
         <w:t>overall_survival</w:t>
       </w:r>
     </w:p>
@@ -21,7 +23,48 @@
         <w:pStyle w:val="Heading2"/>
       </w:pPr>
       <w:r>
-        <w:t>Experiment Information</w:t>
+        <w:t>1. Experiment Information</w:t>
+      </w:r>
+    </w:p>
+    <w:p>
+      <w:pPr>
+        <w:pStyle w:val="Heading3"/>
+      </w:pPr>
+      <w:r>
+        <w:t>Random Wiring Variants:</w:t>
+      </w:r>
+    </w:p>
+    <w:p>
+      <w:r>
+        <w:t>Experiment folder: 2026-03-07_21-08-07_random_wiring_exc20_inh40_pot_10_dep_5</w:t>
+      </w:r>
+    </w:p>
+    <w:p>
+      <w:r>
+        <w:t>Total random variants analyzed: 1000</w:t>
+      </w:r>
+    </w:p>
+    <w:p>
+      <w:r>
+        <w:t>Runs per variant: 100</w:t>
+      </w:r>
+    </w:p>
+    <w:p>
+      <w:r>
+        <w:t>Total data points (random): 100000</w:t>
+      </w:r>
+    </w:p>
+    <w:p>
+      <w:pPr>
+        <w:pStyle w:val="Heading3"/>
+      </w:pPr>
+      <w:r>
+        <w:t>Benchmark Variants:</w:t>
+      </w:r>
+    </w:p>
+    <w:p>
+      <w:r>
+        <w:t>Hard-wired Lookup:</w:t>
       </w:r>
     </w:p>
     <w:p>
@@ -29,7 +72,7 @@
         <w:pStyle w:val="ListBullet"/>
       </w:pPr>
       <w:r>
-        <w:t>Experiment folder: 2026-03-07_21-08-07_random_wiring_exc20_inh40_pot_10_dep_5</w:t>
+        <w:t xml:space="preserve">  Folder: C:\work_hard\byte\data\random_wiring\rawdata\2026-03-08_12-51-56_hardwired_lookup</w:t>
       </w:r>
     </w:p>
     <w:p>
@@ -37,7 +80,7 @@
         <w:pStyle w:val="ListBullet"/>
       </w:pPr>
       <w:r>
-        <w:t>Number of variants: 1000</w:t>
+        <w:t xml:space="preserve">  Number of variants: 2</w:t>
       </w:r>
     </w:p>
     <w:p>
@@ -45,7 +88,15 @@
         <w:pStyle w:val="ListBullet"/>
       </w:pPr>
       <w:r>
-        <w:t>Runs per variant: 100</w:t>
+        <w:t xml:space="preserve">  Runs per variant: 100</w:t>
+      </w:r>
+    </w:p>
+    <w:p>
+      <w:pPr>
+        <w:pStyle w:val="ListBullet"/>
+      </w:pPr>
+      <w:r>
+        <w:t xml:space="preserve">  Total data points: 200</w:t>
       </w:r>
     </w:p>
     <w:p>
@@ -53,7 +104,12 @@
         <w:pStyle w:val="Heading2"/>
       </w:pPr>
       <w:r>
-        <w:t>Summary Statistics</w:t>
+        <w:t>1.1. Summary Statistics - Random Wiring Variants</w:t>
+      </w:r>
+    </w:p>
+    <w:p>
+      <w:r>
+        <w:t>Summary of how long random wiring variants survive in the experimental environment. We measure survival time in simulation ticks and compare the mean and median lifetimes across all 1000 variants to identify which wiring patterns lead to longer survival. The percentile analysis identifies the successful variants with median survival in the top 10% and the least successful variants with median survival in the bottom 10%, which are used for detailed comparisons in subsequent sections.</w:t>
       </w:r>
     </w:p>
     <w:p>
@@ -61,7 +117,7 @@
         <w:pStyle w:val="Heading3"/>
       </w:pPr>
       <w:r>
-        <w:t>Mean survival time (ticks):</w:t>
+        <w:t>Overall Descriptive Statistics (Across All Variants):</w:t>
       </w:r>
     </w:p>
     <w:tbl>
@@ -103,7 +159,7 @@
           </w:tcPr>
           <w:p>
             <w:r>
-              <w:t>Mean across variants</w:t>
+              <w:t>Mean survival across variants (ticks)</w:t>
             </w:r>
           </w:p>
         </w:tc>
@@ -125,7 +181,7 @@
           </w:tcPr>
           <w:p>
             <w:r>
-              <w:t>Std across variants</w:t>
+              <w:t>Std Dev across variants</w:t>
             </w:r>
           </w:p>
         </w:tc>
@@ -190,7 +246,7 @@
         <w:pStyle w:val="Heading3"/>
       </w:pPr>
       <w:r>
-        <w:t>Median survival time (ticks):</w:t>
+        <w:t>Percentile Analysis:</w:t>
       </w:r>
     </w:p>
     <w:tbl>
@@ -220,7 +276,7 @@
           </w:tcPr>
           <w:p>
             <w:r>
-              <w:t>Value</w:t>
+              <w:t>Value (ticks)</w:t>
             </w:r>
           </w:p>
         </w:tc>
@@ -232,7 +288,7 @@
           </w:tcPr>
           <w:p>
             <w:r>
-              <w:t>Mean median across variants</w:t>
+              <w:t>90th percentile threshold (Successful)</w:t>
             </w:r>
           </w:p>
         </w:tc>
@@ -242,7 +298,7 @@
           </w:tcPr>
           <w:p>
             <w:r>
-              <w:t>28.8</w:t>
+              <w:t>43.1</w:t>
             </w:r>
           </w:p>
         </w:tc>
@@ -254,7 +310,7 @@
           </w:tcPr>
           <w:p>
             <w:r>
-              <w:t>Std median across variants</w:t>
+              <w:t>10th percentile threshold (Unsuccessful)</w:t>
             </w:r>
           </w:p>
         </w:tc>
@@ -264,7 +320,29 @@
           </w:tcPr>
           <w:p>
             <w:r>
-              <w:t>14.0</w:t>
+              <w:t>16.0</w:t>
+            </w:r>
+          </w:p>
+        </w:tc>
+      </w:tr>
+      <w:tr>
+        <w:tc>
+          <w:tcPr>
+            <w:tcW w:type="dxa" w:w="4320"/>
+          </w:tcPr>
+          <w:p>
+            <w:r>
+              <w:t>Variants identified in each group</w:t>
+            </w:r>
+          </w:p>
+        </w:tc>
+        <w:tc>
+          <w:tcPr>
+            <w:tcW w:type="dxa" w:w="4320"/>
+          </w:tcPr>
+          <w:p>
+            <w:r>
+              <w:t>Successful: 100, Unsuccessful: 161</w:t>
             </w:r>
           </w:p>
         </w:tc>
@@ -272,10 +350,15 @@
     </w:tbl>
     <w:p>
       <w:pPr>
-        <w:pStyle w:val="Heading3"/>
+        <w:pStyle w:val="Heading2"/>
       </w:pPr>
       <w:r>
-        <w:t>Percentile Analysis (for ranking):</w:t>
+        <w:t>1.2. Summary Statistics - Benchmark Variants</w:t>
+      </w:r>
+    </w:p>
+    <w:p>
+      <w:r>
+        <w:t>Benchmark variants are hard-wired control brains that follow predetermined algorithms rather than evolved random wiring. We compare benchmark survival times to our random wiring variants to evaluate how well random circuits can match or exceed hand-designed solutions. This provides a reference point for assessing the task solution potential of random wiring approaches.</w:t>
       </w:r>
     </w:p>
     <w:tbl>
@@ -285,27 +368,71 @@
         <w:tblLook w:firstColumn="1" w:firstRow="1" w:lastColumn="0" w:lastRow="0" w:noHBand="0" w:noVBand="1" w:val="04A0"/>
       </w:tblPr>
       <w:tblGrid>
-        <w:gridCol w:w="4320"/>
-        <w:gridCol w:w="4320"/>
+        <w:gridCol w:w="1440"/>
+        <w:gridCol w:w="1440"/>
+        <w:gridCol w:w="1440"/>
+        <w:gridCol w:w="1440"/>
+        <w:gridCol w:w="1440"/>
+        <w:gridCol w:w="1440"/>
       </w:tblGrid>
       <w:tr>
         <w:tc>
           <w:tcPr>
-            <w:tcW w:type="dxa" w:w="4320"/>
-          </w:tcPr>
-          <w:p>
-            <w:r>
-              <w:t>Metric</w:t>
-            </w:r>
-          </w:p>
-        </w:tc>
-        <w:tc>
-          <w:tcPr>
-            <w:tcW w:type="dxa" w:w="4320"/>
-          </w:tcPr>
-          <w:p>
-            <w:r>
-              <w:t>Value (ticks)</w:t>
+            <w:tcW w:type="dxa" w:w="1440"/>
+          </w:tcPr>
+          <w:p>
+            <w:r>
+              <w:t>Benchmark</w:t>
+            </w:r>
+          </w:p>
+        </w:tc>
+        <w:tc>
+          <w:tcPr>
+            <w:tcW w:type="dxa" w:w="1440"/>
+          </w:tcPr>
+          <w:p>
+            <w:r>
+              <w:t>N runs</w:t>
+            </w:r>
+          </w:p>
+        </w:tc>
+        <w:tc>
+          <w:tcPr>
+            <w:tcW w:type="dxa" w:w="1440"/>
+          </w:tcPr>
+          <w:p>
+            <w:r>
+              <w:t>Mean (ticks)</w:t>
+            </w:r>
+          </w:p>
+        </w:tc>
+        <w:tc>
+          <w:tcPr>
+            <w:tcW w:type="dxa" w:w="1440"/>
+          </w:tcPr>
+          <w:p>
+            <w:r>
+              <w:t>Median (ticks)</w:t>
+            </w:r>
+          </w:p>
+        </w:tc>
+        <w:tc>
+          <w:tcPr>
+            <w:tcW w:type="dxa" w:w="1440"/>
+          </w:tcPr>
+          <w:p>
+            <w:r>
+              <w:t>Std Dev</w:t>
+            </w:r>
+          </w:p>
+        </w:tc>
+        <w:tc>
+          <w:tcPr>
+            <w:tcW w:type="dxa" w:w="1440"/>
+          </w:tcPr>
+          <w:p>
+            <w:r>
+              <w:t>Min / Max</w:t>
             </w:r>
           </w:p>
         </w:tc>
@@ -313,394 +440,61 @@
       <w:tr>
         <w:tc>
           <w:tcPr>
-            <w:tcW w:type="dxa" w:w="4320"/>
-          </w:tcPr>
-          <w:p>
-            <w:r>
-              <w:t>90th percentile threshold</w:t>
-            </w:r>
-          </w:p>
-        </w:tc>
-        <w:tc>
-          <w:tcPr>
-            <w:tcW w:type="dxa" w:w="4320"/>
-          </w:tcPr>
-          <w:p>
-            <w:r>
-              <w:t>43.1</w:t>
-            </w:r>
-          </w:p>
-        </w:tc>
-      </w:tr>
-      <w:tr>
-        <w:tc>
-          <w:tcPr>
-            <w:tcW w:type="dxa" w:w="4320"/>
-          </w:tcPr>
-          <w:p>
-            <w:r>
-              <w:t>Variants in 90th percentile</w:t>
-            </w:r>
-          </w:p>
-        </w:tc>
-        <w:tc>
-          <w:tcPr>
-            <w:tcW w:type="dxa" w:w="4320"/>
-          </w:tcPr>
-          <w:p>
-            <w:r>
-              <w:t>100</w:t>
-            </w:r>
-          </w:p>
-        </w:tc>
-      </w:tr>
-      <w:tr>
-        <w:tc>
-          <w:tcPr>
-            <w:tcW w:type="dxa" w:w="4320"/>
-          </w:tcPr>
-          <w:p>
-            <w:r>
-              <w:t>10th percentile threshold</w:t>
-            </w:r>
-          </w:p>
-        </w:tc>
-        <w:tc>
-          <w:tcPr>
-            <w:tcW w:type="dxa" w:w="4320"/>
-          </w:tcPr>
-          <w:p>
-            <w:r>
-              <w:t>16.0</w:t>
-            </w:r>
-          </w:p>
-        </w:tc>
-      </w:tr>
-    </w:tbl>
-    <w:p>
-      <w:pPr>
-        <w:pStyle w:val="Heading3"/>
-      </w:pPr>
-      <w:r>
-        <w:t>Statistical Test (Unsuccessful vs Successful):</w:t>
-      </w:r>
-    </w:p>
-    <w:tbl>
-      <w:tblPr>
-        <w:tblStyle w:val="LightGrid-Accent1"/>
-        <w:tblW w:type="auto" w:w="0"/>
-        <w:tblLook w:firstColumn="1" w:firstRow="1" w:lastColumn="0" w:lastRow="0" w:noHBand="0" w:noVBand="1" w:val="04A0"/>
-      </w:tblPr>
-      <w:tblGrid>
-        <w:gridCol w:w="4320"/>
-        <w:gridCol w:w="4320"/>
-      </w:tblGrid>
-      <w:tr>
-        <w:tc>
-          <w:tcPr>
-            <w:tcW w:type="dxa" w:w="4320"/>
-          </w:tcPr>
-          <w:p>
-            <w:r>
-              <w:t>Test</w:t>
-            </w:r>
-          </w:p>
-        </w:tc>
-        <w:tc>
-          <w:tcPr>
-            <w:tcW w:type="dxa" w:w="4320"/>
-          </w:tcPr>
-          <w:p>
-            <w:r>
-              <w:t>Value</w:t>
-            </w:r>
-          </w:p>
-        </w:tc>
-      </w:tr>
-      <w:tr>
-        <w:tc>
-          <w:tcPr>
-            <w:tcW w:type="dxa" w:w="4320"/>
-          </w:tcPr>
-          <w:p>
-            <w:r>
-              <w:t>Mann-Whitney U-statistic</w:t>
-            </w:r>
-          </w:p>
-        </w:tc>
-        <w:tc>
-          <w:tcPr>
-            <w:tcW w:type="dxa" w:w="4320"/>
-          </w:tcPr>
-          <w:p>
-            <w:r>
-              <w:t>6335313.0000</w:t>
-            </w:r>
-          </w:p>
-        </w:tc>
-      </w:tr>
-      <w:tr>
-        <w:tc>
-          <w:tcPr>
-            <w:tcW w:type="dxa" w:w="4320"/>
-          </w:tcPr>
-          <w:p>
-            <w:r>
-              <w:t>p-value</w:t>
-            </w:r>
-          </w:p>
-        </w:tc>
-        <w:tc>
-          <w:tcPr>
-            <w:tcW w:type="dxa" w:w="4320"/>
-          </w:tcPr>
-          <w:p>
-            <w:r>
-              <w:t>0.0000e+00</w:t>
-            </w:r>
-          </w:p>
-        </w:tc>
-      </w:tr>
-    </w:tbl>
-    <w:p>
-      <w:pPr>
-        <w:pStyle w:val="Heading3"/>
-      </w:pPr>
-      <w:r>
-        <w:t>Comparison: Successful vs Unsuccessful Variants:</w:t>
-      </w:r>
-    </w:p>
-    <w:tbl>
-      <w:tblPr>
-        <w:tblStyle w:val="LightGrid-Accent1"/>
-        <w:tblW w:type="auto" w:w="0"/>
-        <w:tblLook w:firstColumn="1" w:firstRow="1" w:lastColumn="0" w:lastRow="0" w:noHBand="0" w:noVBand="1" w:val="04A0"/>
-      </w:tblPr>
-      <w:tblGrid>
-        <w:gridCol w:w="2880"/>
-        <w:gridCol w:w="2880"/>
-        <w:gridCol w:w="2880"/>
-      </w:tblGrid>
-      <w:tr>
-        <w:tc>
-          <w:tcPr>
-            <w:tcW w:type="dxa" w:w="2880"/>
-          </w:tcPr>
-          <w:p>
-            <w:r>
-              <w:t>Metric</w:t>
-            </w:r>
-          </w:p>
-        </w:tc>
-        <w:tc>
-          <w:tcPr>
-            <w:tcW w:type="dxa" w:w="2880"/>
-          </w:tcPr>
-          <w:p>
-            <w:r>
-              <w:t>Successful (Top 10%)</w:t>
-            </w:r>
-          </w:p>
-        </w:tc>
-        <w:tc>
-          <w:tcPr>
-            <w:tcW w:type="dxa" w:w="2880"/>
-          </w:tcPr>
-          <w:p>
-            <w:r>
-              <w:t>Unsuccessful (Bottom 10%)</w:t>
-            </w:r>
-          </w:p>
-        </w:tc>
-      </w:tr>
-      <w:tr>
-        <w:tc>
-          <w:tcPr>
-            <w:tcW w:type="dxa" w:w="2880"/>
-          </w:tcPr>
-          <w:p>
-            <w:r>
-              <w:t>Number of runs</w:t>
-            </w:r>
-          </w:p>
-        </w:tc>
-        <w:tc>
-          <w:tcPr>
-            <w:tcW w:type="dxa" w:w="2880"/>
-          </w:tcPr>
-          <w:p>
-            <w:r>
-              <w:t>10000</w:t>
-            </w:r>
-          </w:p>
-        </w:tc>
-        <w:tc>
-          <w:tcPr>
-            <w:tcW w:type="dxa" w:w="2880"/>
-          </w:tcPr>
-          <w:p>
-            <w:r>
-              <w:t>16100</w:t>
-            </w:r>
-          </w:p>
-        </w:tc>
-      </w:tr>
-      <w:tr>
-        <w:tc>
-          <w:tcPr>
-            <w:tcW w:type="dxa" w:w="2880"/>
-          </w:tcPr>
-          <w:p>
-            <w:r>
-              <w:t>Mean (ticks)</w:t>
-            </w:r>
-          </w:p>
-        </w:tc>
-        <w:tc>
-          <w:tcPr>
-            <w:tcW w:type="dxa" w:w="2880"/>
-          </w:tcPr>
-          <w:p>
-            <w:r>
-              <w:t>92.4</w:t>
-            </w:r>
-          </w:p>
-        </w:tc>
-        <w:tc>
-          <w:tcPr>
-            <w:tcW w:type="dxa" w:w="2880"/>
-          </w:tcPr>
-          <w:p>
-            <w:r>
-              <w:t>18.5</w:t>
-            </w:r>
-          </w:p>
-        </w:tc>
-      </w:tr>
-      <w:tr>
-        <w:tc>
-          <w:tcPr>
-            <w:tcW w:type="dxa" w:w="2880"/>
-          </w:tcPr>
-          <w:p>
-            <w:r>
-              <w:t>Median (ticks)</w:t>
-            </w:r>
-          </w:p>
-        </w:tc>
-        <w:tc>
-          <w:tcPr>
-            <w:tcW w:type="dxa" w:w="2880"/>
-          </w:tcPr>
-          <w:p>
-            <w:r>
-              <w:t>54.0</w:t>
-            </w:r>
-          </w:p>
-        </w:tc>
-        <w:tc>
-          <w:tcPr>
-            <w:tcW w:type="dxa" w:w="2880"/>
-          </w:tcPr>
-          <w:p>
-            <w:r>
-              <w:t>16.0</w:t>
-            </w:r>
-          </w:p>
-        </w:tc>
-      </w:tr>
-      <w:tr>
-        <w:tc>
-          <w:tcPr>
-            <w:tcW w:type="dxa" w:w="2880"/>
-          </w:tcPr>
-          <w:p>
-            <w:r>
-              <w:t>Std Dev (ticks)</w:t>
-            </w:r>
-          </w:p>
-        </w:tc>
-        <w:tc>
-          <w:tcPr>
-            <w:tcW w:type="dxa" w:w="2880"/>
-          </w:tcPr>
-          <w:p>
-            <w:r>
-              <w:t>137.4</w:t>
-            </w:r>
-          </w:p>
-        </w:tc>
-        <w:tc>
-          <w:tcPr>
-            <w:tcW w:type="dxa" w:w="2880"/>
-          </w:tcPr>
-          <w:p>
-            <w:r>
-              <w:t>21.2</w:t>
-            </w:r>
-          </w:p>
-        </w:tc>
-      </w:tr>
-      <w:tr>
-        <w:tc>
-          <w:tcPr>
-            <w:tcW w:type="dxa" w:w="2880"/>
-          </w:tcPr>
-          <w:p>
-            <w:r>
-              <w:t>Min (ticks)</w:t>
-            </w:r>
-          </w:p>
-        </w:tc>
-        <w:tc>
-          <w:tcPr>
-            <w:tcW w:type="dxa" w:w="2880"/>
-          </w:tcPr>
-          <w:p>
-            <w:r>
-              <w:t>16.0</w:t>
-            </w:r>
-          </w:p>
-        </w:tc>
-        <w:tc>
-          <w:tcPr>
-            <w:tcW w:type="dxa" w:w="2880"/>
-          </w:tcPr>
-          <w:p>
-            <w:r>
-              <w:t>16.0</w:t>
-            </w:r>
-          </w:p>
-        </w:tc>
-      </w:tr>
-      <w:tr>
-        <w:tc>
-          <w:tcPr>
-            <w:tcW w:type="dxa" w:w="2880"/>
-          </w:tcPr>
-          <w:p>
-            <w:r>
-              <w:t>Max (ticks)</w:t>
-            </w:r>
-          </w:p>
-        </w:tc>
-        <w:tc>
-          <w:tcPr>
-            <w:tcW w:type="dxa" w:w="2880"/>
-          </w:tcPr>
-          <w:p>
-            <w:r>
-              <w:t>1000.0</w:t>
-            </w:r>
-          </w:p>
-        </w:tc>
-        <w:tc>
-          <w:tcPr>
-            <w:tcW w:type="dxa" w:w="2880"/>
-          </w:tcPr>
-          <w:p>
-            <w:r>
-              <w:t>1000.0</w:t>
+            <w:tcW w:type="dxa" w:w="1440"/>
+          </w:tcPr>
+          <w:p>
+            <w:r>
+              <w:t>Hard-wired Lookup</w:t>
+            </w:r>
+          </w:p>
+        </w:tc>
+        <w:tc>
+          <w:tcPr>
+            <w:tcW w:type="dxa" w:w="1440"/>
+          </w:tcPr>
+          <w:p>
+            <w:r>
+              <w:t>200</w:t>
+            </w:r>
+          </w:p>
+        </w:tc>
+        <w:tc>
+          <w:tcPr>
+            <w:tcW w:type="dxa" w:w="1440"/>
+          </w:tcPr>
+          <w:p>
+            <w:r>
+              <w:t>371.7</w:t>
+            </w:r>
+          </w:p>
+        </w:tc>
+        <w:tc>
+          <w:tcPr>
+            <w:tcW w:type="dxa" w:w="1440"/>
+          </w:tcPr>
+          <w:p>
+            <w:r>
+              <w:t>30.0</w:t>
+            </w:r>
+          </w:p>
+        </w:tc>
+        <w:tc>
+          <w:tcPr>
+            <w:tcW w:type="dxa" w:w="1440"/>
+          </w:tcPr>
+          <w:p>
+            <w:r>
+              <w:t>461.1</w:t>
+            </w:r>
+          </w:p>
+        </w:tc>
+        <w:tc>
+          <w:tcPr>
+            <w:tcW w:type="dxa" w:w="1440"/>
+          </w:tcPr>
+          <w:p>
+            <w:r>
+              <w:t>24.0 / 1000.0</w:t>
             </w:r>
           </w:p>
         </w:tc>
@@ -711,20 +505,37 @@
         <w:pStyle w:val="Heading2"/>
       </w:pPr>
       <w:r>
-        <w:t>Analysis Figures and Results</w:t>
-      </w:r>
-    </w:p>
-    <w:p>
-      <w:pPr>
-        <w:pStyle w:val="Heading3"/>
-      </w:pPr>
-      <w:r>
-        <w:t>1. Survival Race - All Variants</w:t>
+        <w:t>2. Survival Race Selection</w:t>
       </w:r>
     </w:p>
     <w:p>
       <w:r>
-        <w:t>This plot shows the survival curves for all 1000 wiring variants. Lines are color-coded by percentile: green indicates top 10% (median ≥ 43.1 ticks), red indicates bottom 10% (median ≤ 16.0 ticks), and gray indicates the middle 80%.</w:t>
+        <w:t>The survival race plot tracks how many individuals from each wiring variant survive over time. Each curve represents a variant's cumulative survival, showing how fitness changes across the simulation. We use this visualization to identify which variants are robustly long-lived. The comparison table shows key statistics for successful versus unsuccessful variants, helping quantify the performance gap.</w:t>
+      </w:r>
+    </w:p>
+    <w:p>
+      <w:r>
+        <w:t>This plot shows the survival curves for all 1000 wiring variants. Variants are color-coded by their performance percentile:</w:t>
+      </w:r>
+    </w:p>
+    <w:p>
+      <w:r>
+        <w:t xml:space="preserve">  • Green: Top 10% (median survival ≥ 43.1 ticks) — 100 variants</w:t>
+      </w:r>
+    </w:p>
+    <w:p>
+      <w:r>
+        <w:t xml:space="preserve">  • Red: Bottom 10% (median survival ≤ 16.0 ticks) — 161 variants</w:t>
+      </w:r>
+    </w:p>
+    <w:p>
+      <w:r>
+        <w:t xml:space="preserve">  • Gray: Middle 80% (other variants)</w:t>
+      </w:r>
+    </w:p>
+    <w:p>
+      <w:r>
+        <w:t xml:space="preserve">  • Colored lines: Benchmark variants</w:t>
       </w:r>
     </w:p>
     <w:p>
@@ -765,16 +576,8 @@
     </w:p>
     <w:p/>
     <w:p>
-      <w:pPr>
-        <w:pStyle w:val="Heading3"/>
-      </w:pPr>
       <w:r>
-        <w:t>2. Survival Time Comparison: Unsuccessful vs Successful</w:t>
-      </w:r>
-    </w:p>
-    <w:p>
-      <w:r>
-        <w:t>Statistical Comparison of Lifetime Durations:</w:t>
+        <w:t>Successful vs Unsuccessful Comparison:</w:t>
       </w:r>
     </w:p>
     <w:tbl>
@@ -1015,91 +818,9 @@
     </w:tbl>
     <w:p>
       <w:r>
-        <w:t>Mann-Whitney U Test Results (non-parametric test for non-normal distributions):</w:t>
-      </w:r>
-    </w:p>
-    <w:tbl>
-      <w:tblPr>
-        <w:tblStyle w:val="LightGrid-Accent1"/>
-        <w:tblW w:type="auto" w:w="0"/>
-        <w:tblLook w:firstColumn="1" w:firstRow="1" w:lastColumn="0" w:lastRow="0" w:noHBand="0" w:noVBand="1" w:val="04A0"/>
-      </w:tblPr>
-      <w:tblGrid>
-        <w:gridCol w:w="4320"/>
-        <w:gridCol w:w="4320"/>
-      </w:tblGrid>
-      <w:tr>
-        <w:tc>
-          <w:tcPr>
-            <w:tcW w:type="dxa" w:w="4320"/>
-          </w:tcPr>
-          <w:p>
-            <w:r>
-              <w:t>Test Statistic</w:t>
-            </w:r>
-          </w:p>
-        </w:tc>
-        <w:tc>
-          <w:tcPr>
-            <w:tcW w:type="dxa" w:w="4320"/>
-          </w:tcPr>
-          <w:p>
-            <w:r>
-              <w:t>Value</w:t>
-            </w:r>
-          </w:p>
-        </w:tc>
-      </w:tr>
-      <w:tr>
-        <w:tc>
-          <w:tcPr>
-            <w:tcW w:type="dxa" w:w="4320"/>
-          </w:tcPr>
-          <w:p>
-            <w:r>
-              <w:t>Mann-Whitney U-statistic</w:t>
-            </w:r>
-          </w:p>
-        </w:tc>
-        <w:tc>
-          <w:tcPr>
-            <w:tcW w:type="dxa" w:w="4320"/>
-          </w:tcPr>
-          <w:p>
-            <w:r>
-              <w:t>6335313.0000</w:t>
-            </w:r>
-          </w:p>
-        </w:tc>
-      </w:tr>
-      <w:tr>
-        <w:tc>
-          <w:tcPr>
-            <w:tcW w:type="dxa" w:w="4320"/>
-          </w:tcPr>
-          <w:p>
-            <w:r>
-              <w:t>p-value</w:t>
-            </w:r>
-          </w:p>
-        </w:tc>
-        <w:tc>
-          <w:tcPr>
-            <w:tcW w:type="dxa" w:w="4320"/>
-          </w:tcPr>
-          <w:p>
-            <w:r>
-              <w:t>0.0000e+00</w:t>
-            </w:r>
-          </w:p>
-        </w:tc>
-      </w:tr>
-    </w:tbl>
-    <w:p>
-      <w:r>
         <w:drawing>
           <wp:inline xmlns:a="http://schemas.openxmlformats.org/drawingml/2006/main" xmlns:pic="http://schemas.openxmlformats.org/drawingml/2006/picture">
-            <wp:extent cx="5486400" cy="4357293"/>
+            <wp:extent cx="5486400" cy="3609474"/>
             <wp:docPr id="2" name="Picture 2"/>
             <wp:cNvGraphicFramePr>
               <a:graphicFrameLocks noChangeAspect="1"/>
@@ -1120,7 +841,7 @@
                   <pic:spPr>
                     <a:xfrm>
                       <a:off x="0" y="0"/>
-                      <a:ext cx="5486400" cy="4357293"/>
+                      <a:ext cx="5486400" cy="3609474"/>
                     </a:xfrm>
                     <a:prstGeom prst="rect"/>
                   </pic:spPr>
@@ -1137,17 +858,399 @@
         <w:pStyle w:val="Heading3"/>
       </w:pPr>
       <w:r>
-        <w:t>3. Movement Efficiency by Direction</w:t>
+        <w:t>Mann-Whitney U Test Results (Random Variants Only):</w:t>
+      </w:r>
+    </w:p>
+    <w:p>
+      <w:r>
+        <w:t xml:space="preserve">This statistical test compares whether successful and unsuccessful random variants have significantly different survival distributions. </w:t>
+      </w:r>
+    </w:p>
+    <w:tbl>
+      <w:tblPr>
+        <w:tblStyle w:val="LightGrid-Accent1"/>
+        <w:tblW w:type="auto" w:w="0"/>
+        <w:tblLook w:firstColumn="1" w:firstRow="1" w:lastColumn="0" w:lastRow="0" w:noHBand="0" w:noVBand="1" w:val="04A0"/>
+      </w:tblPr>
+      <w:tblGrid>
+        <w:gridCol w:w="4320"/>
+        <w:gridCol w:w="4320"/>
+      </w:tblGrid>
+      <w:tr>
+        <w:tc>
+          <w:tcPr>
+            <w:tcW w:type="dxa" w:w="4320"/>
+          </w:tcPr>
+          <w:p>
+            <w:r>
+              <w:t>Test Statistic</w:t>
+            </w:r>
+          </w:p>
+        </w:tc>
+        <w:tc>
+          <w:tcPr>
+            <w:tcW w:type="dxa" w:w="4320"/>
+          </w:tcPr>
+          <w:p>
+            <w:r>
+              <w:t>Value</w:t>
+            </w:r>
+          </w:p>
+        </w:tc>
+      </w:tr>
+      <w:tr>
+        <w:tc>
+          <w:tcPr>
+            <w:tcW w:type="dxa" w:w="4320"/>
+          </w:tcPr>
+          <w:p>
+            <w:r>
+              <w:t>U-statistic</w:t>
+            </w:r>
+          </w:p>
+        </w:tc>
+        <w:tc>
+          <w:tcPr>
+            <w:tcW w:type="dxa" w:w="4320"/>
+          </w:tcPr>
+          <w:p>
+            <w:r>
+              <w:t>6335313.0000</w:t>
+            </w:r>
+          </w:p>
+        </w:tc>
+      </w:tr>
+      <w:tr>
+        <w:tc>
+          <w:tcPr>
+            <w:tcW w:type="dxa" w:w="4320"/>
+          </w:tcPr>
+          <w:p>
+            <w:r>
+              <w:t>p-value</w:t>
+            </w:r>
+          </w:p>
+        </w:tc>
+        <w:tc>
+          <w:tcPr>
+            <w:tcW w:type="dxa" w:w="4320"/>
+          </w:tcPr>
+          <w:p>
+            <w:r>
+              <w:t>0.0000e+00</w:t>
+            </w:r>
+          </w:p>
+        </w:tc>
+      </w:tr>
+    </w:tbl>
+    <w:p/>
+    <w:p/>
+    <w:p>
+      <w:pPr>
+        <w:pStyle w:val="Heading3"/>
+      </w:pPr>
+      <w:r>
+        <w:t>Kruskal-Wallis Test Results (All Groups):</w:t>
+      </w:r>
+    </w:p>
+    <w:p>
+      <w:r>
+        <w:t>Kruskal-Wallis test compares all three groups simultaneously: successful variants, unsuccessful variants, and benchmark variants. It tests whether significant differences exist across all groups.</w:t>
+      </w:r>
+    </w:p>
+    <w:tbl>
+      <w:tblPr>
+        <w:tblStyle w:val="LightGrid-Accent1"/>
+        <w:tblW w:type="auto" w:w="0"/>
+        <w:tblLook w:firstColumn="1" w:firstRow="1" w:lastColumn="0" w:lastRow="0" w:noHBand="0" w:noVBand="1" w:val="04A0"/>
+      </w:tblPr>
+      <w:tblGrid>
+        <w:gridCol w:w="4320"/>
+        <w:gridCol w:w="4320"/>
+      </w:tblGrid>
+      <w:tr>
+        <w:tc>
+          <w:tcPr>
+            <w:tcW w:type="dxa" w:w="4320"/>
+          </w:tcPr>
+          <w:p>
+            <w:r>
+              <w:t>Test Statistic</w:t>
+            </w:r>
+          </w:p>
+        </w:tc>
+        <w:tc>
+          <w:tcPr>
+            <w:tcW w:type="dxa" w:w="4320"/>
+          </w:tcPr>
+          <w:p>
+            <w:r>
+              <w:t>Value</w:t>
+            </w:r>
+          </w:p>
+        </w:tc>
+      </w:tr>
+      <w:tr>
+        <w:tc>
+          <w:tcPr>
+            <w:tcW w:type="dxa" w:w="4320"/>
+          </w:tcPr>
+          <w:p>
+            <w:r>
+              <w:t>H-statistic</w:t>
+            </w:r>
+          </w:p>
+        </w:tc>
+        <w:tc>
+          <w:tcPr>
+            <w:tcW w:type="dxa" w:w="4320"/>
+          </w:tcPr>
+          <w:p>
+            <w:r>
+              <w:t>17764.2811</w:t>
+            </w:r>
+          </w:p>
+        </w:tc>
+      </w:tr>
+      <w:tr>
+        <w:tc>
+          <w:tcPr>
+            <w:tcW w:type="dxa" w:w="4320"/>
+          </w:tcPr>
+          <w:p>
+            <w:r>
+              <w:t>p-value</w:t>
+            </w:r>
+          </w:p>
+        </w:tc>
+        <w:tc>
+          <w:tcPr>
+            <w:tcW w:type="dxa" w:w="4320"/>
+          </w:tcPr>
+          <w:p>
+            <w:r>
+              <w:t>0.0000e+00</w:t>
+            </w:r>
+          </w:p>
+        </w:tc>
+      </w:tr>
+    </w:tbl>
+    <w:p/>
+    <w:p>
+      <w:r>
+        <w:t>Dunn's Post-hoc Test Results (pairwise comparisons, Bonferroni-adjusted):</w:t>
+      </w:r>
+    </w:p>
+    <w:tbl>
+      <w:tblPr>
+        <w:tblStyle w:val="LightGrid-Accent1"/>
+        <w:tblW w:type="auto" w:w="0"/>
+        <w:tblLook w:firstColumn="1" w:firstRow="1" w:lastColumn="0" w:lastRow="0" w:noHBand="0" w:noVBand="1" w:val="04A0"/>
+      </w:tblPr>
+      <w:tblGrid>
+        <w:gridCol w:w="2160"/>
+        <w:gridCol w:w="2160"/>
+        <w:gridCol w:w="2160"/>
+        <w:gridCol w:w="2160"/>
+      </w:tblGrid>
+      <w:tr>
+        <w:tc>
+          <w:tcPr>
+            <w:tcW w:type="dxa" w:w="2160"/>
+          </w:tcPr>
+          <w:p>
+            <w:r>
+              <w:t>Comparison</w:t>
+            </w:r>
+          </w:p>
+        </w:tc>
+        <w:tc>
+          <w:tcPr>
+            <w:tcW w:type="dxa" w:w="2160"/>
+          </w:tcPr>
+          <w:p>
+            <w:r>
+              <w:t>Hard-wired Lookup</w:t>
+            </w:r>
+          </w:p>
+        </w:tc>
+        <w:tc>
+          <w:tcPr>
+            <w:tcW w:type="dxa" w:w="2160"/>
+          </w:tcPr>
+          <w:p>
+            <w:r>
+              <w:t>Successful</w:t>
+            </w:r>
+          </w:p>
+        </w:tc>
+        <w:tc>
+          <w:tcPr>
+            <w:tcW w:type="dxa" w:w="2160"/>
+          </w:tcPr>
+          <w:p>
+            <w:r>
+              <w:t>Unsuccessful</w:t>
+            </w:r>
+          </w:p>
+        </w:tc>
+      </w:tr>
+      <w:tr>
+        <w:tc>
+          <w:tcPr>
+            <w:tcW w:type="dxa" w:w="2160"/>
+          </w:tcPr>
+          <w:p>
+            <w:r>
+              <w:t>Hard-wired Lookup</w:t>
+            </w:r>
+          </w:p>
+        </w:tc>
+        <w:tc>
+          <w:tcPr>
+            <w:tcW w:type="dxa" w:w="2160"/>
+          </w:tcPr>
+          <w:p>
+            <w:r>
+              <w:t>1.0000</w:t>
+            </w:r>
+          </w:p>
+        </w:tc>
+        <w:tc>
+          <w:tcPr>
+            <w:tcW w:type="dxa" w:w="2160"/>
+          </w:tcPr>
+          <w:p>
+            <w:r>
+              <w:t>1.0000</w:t>
+            </w:r>
+          </w:p>
+        </w:tc>
+        <w:tc>
+          <w:tcPr>
+            <w:tcW w:type="dxa" w:w="2160"/>
+          </w:tcPr>
+          <w:p>
+            <w:r>
+              <w:t>0.0000</w:t>
+            </w:r>
+          </w:p>
+        </w:tc>
+      </w:tr>
+      <w:tr>
+        <w:tc>
+          <w:tcPr>
+            <w:tcW w:type="dxa" w:w="2160"/>
+          </w:tcPr>
+          <w:p>
+            <w:r>
+              <w:t>Successful</w:t>
+            </w:r>
+          </w:p>
+        </w:tc>
+        <w:tc>
+          <w:tcPr>
+            <w:tcW w:type="dxa" w:w="2160"/>
+          </w:tcPr>
+          <w:p>
+            <w:r>
+              <w:t>1.0000</w:t>
+            </w:r>
+          </w:p>
+        </w:tc>
+        <w:tc>
+          <w:tcPr>
+            <w:tcW w:type="dxa" w:w="2160"/>
+          </w:tcPr>
+          <w:p>
+            <w:r>
+              <w:t>1.0000</w:t>
+            </w:r>
+          </w:p>
+        </w:tc>
+        <w:tc>
+          <w:tcPr>
+            <w:tcW w:type="dxa" w:w="2160"/>
+          </w:tcPr>
+          <w:p>
+            <w:r>
+              <w:t>0.0000</w:t>
+            </w:r>
+          </w:p>
+        </w:tc>
+      </w:tr>
+      <w:tr>
+        <w:tc>
+          <w:tcPr>
+            <w:tcW w:type="dxa" w:w="2160"/>
+          </w:tcPr>
+          <w:p>
+            <w:r>
+              <w:t>Unsuccessful</w:t>
+            </w:r>
+          </w:p>
+        </w:tc>
+        <w:tc>
+          <w:tcPr>
+            <w:tcW w:type="dxa" w:w="2160"/>
+          </w:tcPr>
+          <w:p>
+            <w:r>
+              <w:t>0.0000</w:t>
+            </w:r>
+          </w:p>
+        </w:tc>
+        <w:tc>
+          <w:tcPr>
+            <w:tcW w:type="dxa" w:w="2160"/>
+          </w:tcPr>
+          <w:p>
+            <w:r>
+              <w:t>0.0000</w:t>
+            </w:r>
+          </w:p>
+        </w:tc>
+        <w:tc>
+          <w:tcPr>
+            <w:tcW w:type="dxa" w:w="2160"/>
+          </w:tcPr>
+          <w:p>
+            <w:r>
+              <w:t>1.0000</w:t>
+            </w:r>
+          </w:p>
+        </w:tc>
+      </w:tr>
+    </w:tbl>
+    <w:p>
+      <w:pPr>
+        <w:pStyle w:val="Heading2"/>
+      </w:pPr>
+      <w:r>
+        <w:t>3. Comparison between groups</w:t>
+      </w:r>
+    </w:p>
+    <w:p>
+      <w:r>
+        <w:t xml:space="preserve">Break down of successful versus unsuccessful variants across multiple metrics. </w:t>
+      </w:r>
+    </w:p>
+    <w:p>
+      <w:pPr>
+        <w:pStyle w:val="Heading2"/>
+      </w:pPr>
+      <w:r>
+        <w:t>3.1. Movement Efficiency</w:t>
+      </w:r>
+    </w:p>
+    <w:p>
+      <w:r>
+        <w:t>For each cardinal direction (North, East, South, West), we calculate the ratio of movement commands to sensory detections. A ratio close to 1.0 indicates tight coupling between sensing and movement (reflexory behavior: the worm moves in response to each sensory detection). Ratios far from 1.0 (either much higher or much lower) indicate decoupling: the worm either moves more without sensing, or senses food but moves selectively. This metric reveals fundamental differences in movement strategy between successful and unsuccessful variants—whether they rely on reflexory sensorimotor coupling or employ a different navigation strategy.</w:t>
       </w:r>
     </w:p>
     <w:p>
       <w:r>
         <w:t>Movement Efficiency = Movement Count ÷ Sensing Count per direction</w:t>
-      </w:r>
-    </w:p>
-    <w:p>
-      <w:r>
-        <w:t>Efficiency Statistics (Mean ± Std Dev):</w:t>
       </w:r>
     </w:p>
     <w:tbl>
@@ -1178,7 +1281,7 @@
           </w:tcPr>
           <w:p>
             <w:r>
-              <w:t>Unsuccessful</w:t>
+              <w:t>Unsuccessful (Mean ± Std)</w:t>
             </w:r>
           </w:p>
         </w:tc>
@@ -1188,7 +1291,7 @@
           </w:tcPr>
           <w:p>
             <w:r>
-              <w:t>Successful</w:t>
+              <w:t>Successful (Mean ± Std)</w:t>
             </w:r>
           </w:p>
         </w:tc>
@@ -1326,7 +1429,7 @@
       <w:r>
         <w:drawing>
           <wp:inline xmlns:a="http://schemas.openxmlformats.org/drawingml/2006/main" xmlns:pic="http://schemas.openxmlformats.org/drawingml/2006/picture">
-            <wp:extent cx="5486400" cy="2333327"/>
+            <wp:extent cx="5486400" cy="1791680"/>
             <wp:docPr id="3" name="Picture 3"/>
             <wp:cNvGraphicFramePr>
               <a:graphicFrameLocks noChangeAspect="1"/>
@@ -1347,7 +1450,7 @@
                   <pic:spPr>
                     <a:xfrm>
                       <a:off x="0" y="0"/>
-                      <a:ext cx="5486400" cy="2333327"/>
+                      <a:ext cx="5486400" cy="1791680"/>
                     </a:xfrm>
                     <a:prstGeom prst="rect"/>
                   </pic:spPr>
@@ -1361,20 +1464,20 @@
     <w:p/>
     <w:p>
       <w:pPr>
-        <w:pStyle w:val="Heading3"/>
+        <w:pStyle w:val="Heading2"/>
       </w:pPr>
       <w:r>
-        <w:t>4. Decision Accuracy: Unsuccessful vs Successful</w:t>
+        <w:t>3.2. Decision Accuracy</w:t>
+      </w:r>
+    </w:p>
+    <w:p>
+      <w:r>
+        <w:t>Decision accuracy quantifies how often choices are aligned with food source locations. This measures the quality of neural computation, whether the wiring interprets sensory input to direct movement toward food. Higher accuracy indicates more reliable neural circuits. We compare the distribution of accuracy values between successful and unsuccessful variants to determine whether fitness correlates with decision-making precision, or if other factors like movement efficiency play a larger role. Note that moving onto sensed food is a very shortsighted strategy that might not lead to an optimal solution in more complex tasks e.g. with food regrow in previous positions.</w:t>
       </w:r>
     </w:p>
     <w:p>
       <w:r>
         <w:t>Decision Accuracy = Correct Decisions ÷ Total Decisions</w:t>
-      </w:r>
-    </w:p>
-    <w:p>
-      <w:r>
-        <w:t>Statistical Comparison of Decision Accuracy:</w:t>
       </w:r>
     </w:p>
     <w:tbl>
@@ -1615,7 +1718,7 @@
     </w:tbl>
     <w:p>
       <w:r>
-        <w:t>Mann-Whitney U Test Results:</w:t>
+        <w:t>Kruskal-Wallis Test Results:</w:t>
       </w:r>
     </w:p>
     <w:tbl>
@@ -1657,7 +1760,7 @@
           </w:tcPr>
           <w:p>
             <w:r>
-              <w:t>Mann-Whitney U-statistic</w:t>
+              <w:t>H-statistic</w:t>
             </w:r>
           </w:p>
         </w:tc>
@@ -1667,7 +1770,7 @@
           </w:tcPr>
           <w:p>
             <w:r>
-              <w:t>122573739.0000</w:t>
+              <w:t>5221.2071</w:t>
             </w:r>
           </w:p>
         </w:tc>
@@ -1690,6 +1793,193 @@
           <w:p>
             <w:r>
               <w:t>0.0000e+00</w:t>
+            </w:r>
+          </w:p>
+        </w:tc>
+      </w:tr>
+    </w:tbl>
+    <w:p/>
+    <w:p>
+      <w:r>
+        <w:t>Dunn's Post-hoc Test Results (pairwise comparisons, Bonferroni-adjusted):</w:t>
+      </w:r>
+    </w:p>
+    <w:tbl>
+      <w:tblPr>
+        <w:tblStyle w:val="LightGrid-Accent1"/>
+        <w:tblW w:type="auto" w:w="0"/>
+        <w:tblLook w:firstColumn="1" w:firstRow="1" w:lastColumn="0" w:lastRow="0" w:noHBand="0" w:noVBand="1" w:val="04A0"/>
+      </w:tblPr>
+      <w:tblGrid>
+        <w:gridCol w:w="2160"/>
+        <w:gridCol w:w="2160"/>
+        <w:gridCol w:w="2160"/>
+        <w:gridCol w:w="2160"/>
+      </w:tblGrid>
+      <w:tr>
+        <w:tc>
+          <w:tcPr>
+            <w:tcW w:type="dxa" w:w="2160"/>
+          </w:tcPr>
+          <w:p>
+            <w:r>
+              <w:t>Comparison</w:t>
+            </w:r>
+          </w:p>
+        </w:tc>
+        <w:tc>
+          <w:tcPr>
+            <w:tcW w:type="dxa" w:w="2160"/>
+          </w:tcPr>
+          <w:p>
+            <w:r>
+              <w:t>Hard-wired Lookup</w:t>
+            </w:r>
+          </w:p>
+        </w:tc>
+        <w:tc>
+          <w:tcPr>
+            <w:tcW w:type="dxa" w:w="2160"/>
+          </w:tcPr>
+          <w:p>
+            <w:r>
+              <w:t>Successful</w:t>
+            </w:r>
+          </w:p>
+        </w:tc>
+        <w:tc>
+          <w:tcPr>
+            <w:tcW w:type="dxa" w:w="2160"/>
+          </w:tcPr>
+          <w:p>
+            <w:r>
+              <w:t>Unsuccessful</w:t>
+            </w:r>
+          </w:p>
+        </w:tc>
+      </w:tr>
+      <w:tr>
+        <w:tc>
+          <w:tcPr>
+            <w:tcW w:type="dxa" w:w="2160"/>
+          </w:tcPr>
+          <w:p>
+            <w:r>
+              <w:t>Hard-wired Lookup</w:t>
+            </w:r>
+          </w:p>
+        </w:tc>
+        <w:tc>
+          <w:tcPr>
+            <w:tcW w:type="dxa" w:w="2160"/>
+          </w:tcPr>
+          <w:p>
+            <w:r>
+              <w:t>1.0000</w:t>
+            </w:r>
+          </w:p>
+        </w:tc>
+        <w:tc>
+          <w:tcPr>
+            <w:tcW w:type="dxa" w:w="2160"/>
+          </w:tcPr>
+          <w:p>
+            <w:r>
+              <w:t>0.0000</w:t>
+            </w:r>
+          </w:p>
+        </w:tc>
+        <w:tc>
+          <w:tcPr>
+            <w:tcW w:type="dxa" w:w="2160"/>
+          </w:tcPr>
+          <w:p>
+            <w:r>
+              <w:t>0.0000</w:t>
+            </w:r>
+          </w:p>
+        </w:tc>
+      </w:tr>
+      <w:tr>
+        <w:tc>
+          <w:tcPr>
+            <w:tcW w:type="dxa" w:w="2160"/>
+          </w:tcPr>
+          <w:p>
+            <w:r>
+              <w:t>Successful</w:t>
+            </w:r>
+          </w:p>
+        </w:tc>
+        <w:tc>
+          <w:tcPr>
+            <w:tcW w:type="dxa" w:w="2160"/>
+          </w:tcPr>
+          <w:p>
+            <w:r>
+              <w:t>0.0000</w:t>
+            </w:r>
+          </w:p>
+        </w:tc>
+        <w:tc>
+          <w:tcPr>
+            <w:tcW w:type="dxa" w:w="2160"/>
+          </w:tcPr>
+          <w:p>
+            <w:r>
+              <w:t>1.0000</w:t>
+            </w:r>
+          </w:p>
+        </w:tc>
+        <w:tc>
+          <w:tcPr>
+            <w:tcW w:type="dxa" w:w="2160"/>
+          </w:tcPr>
+          <w:p>
+            <w:r>
+              <w:t>0.0000</w:t>
+            </w:r>
+          </w:p>
+        </w:tc>
+      </w:tr>
+      <w:tr>
+        <w:tc>
+          <w:tcPr>
+            <w:tcW w:type="dxa" w:w="2160"/>
+          </w:tcPr>
+          <w:p>
+            <w:r>
+              <w:t>Unsuccessful</w:t>
+            </w:r>
+          </w:p>
+        </w:tc>
+        <w:tc>
+          <w:tcPr>
+            <w:tcW w:type="dxa" w:w="2160"/>
+          </w:tcPr>
+          <w:p>
+            <w:r>
+              <w:t>0.0000</w:t>
+            </w:r>
+          </w:p>
+        </w:tc>
+        <w:tc>
+          <w:tcPr>
+            <w:tcW w:type="dxa" w:w="2160"/>
+          </w:tcPr>
+          <w:p>
+            <w:r>
+              <w:t>0.0000</w:t>
+            </w:r>
+          </w:p>
+        </w:tc>
+        <w:tc>
+          <w:tcPr>
+            <w:tcW w:type="dxa" w:w="2160"/>
+          </w:tcPr>
+          <w:p>
+            <w:r>
+              <w:t>1.0000</w:t>
             </w:r>
           </w:p>
         </w:tc>
@@ -1699,7 +1989,7 @@
       <w:r>
         <w:drawing>
           <wp:inline xmlns:a="http://schemas.openxmlformats.org/drawingml/2006/main" xmlns:pic="http://schemas.openxmlformats.org/drawingml/2006/picture">
-            <wp:extent cx="5486400" cy="4354286"/>
+            <wp:extent cx="5486400" cy="3607410"/>
             <wp:docPr id="4" name="Picture 4"/>
             <wp:cNvGraphicFramePr>
               <a:graphicFrameLocks noChangeAspect="1"/>
@@ -1720,7 +2010,7 @@
                   <pic:spPr>
                     <a:xfrm>
                       <a:off x="0" y="0"/>
-                      <a:ext cx="5486400" cy="4354286"/>
+                      <a:ext cx="5486400" cy="3607410"/>
                     </a:xfrm>
                     <a:prstGeom prst="rect"/>
                   </pic:spPr>
@@ -1734,21 +2024,15 @@
     <w:p/>
     <w:p>
       <w:pPr>
-        <w:pStyle w:val="Heading3"/>
+        <w:pStyle w:val="Heading2"/>
       </w:pPr>
       <w:r>
-        <w:t>5. Decision Diagnostic Analysis: Why Accuracy Doesn't Predict Survival</w:t>
+        <w:t>3.3. Decision Details</w:t>
       </w:r>
     </w:p>
     <w:p>
       <w:r>
-        <w:t>A critical finding: unsuccessful variants have HIGHER decision accuracy (33%) than successful variants (18%), but shorter lifespans. This diagnostic analysis reveals why. A 'decision' only occurs when the worm senses food AND is not on food. A 'correct decision' is when movement matches sensed food direction.</w:t>
-      </w:r>
-    </w:p>
-    <w:p/>
-    <w:p>
-      <w:r>
-        <w:t>Decision-Making Strategy Comparison:</w:t>
+        <w:t>Decision-making behavior at the level of individual simulation ticks. We track how frequently decisions are made and how this relates to survival. This reveals whether success comes from making more decisions, fewer decisions, or from the quality rather than quantity of decisions.</w:t>
       </w:r>
     </w:p>
     <w:tbl>
@@ -1893,20 +2177,9 @@
     </w:tbl>
     <w:p>
       <w:r>
-        <w:t>Key Insight:</w:t>
-      </w:r>
-    </w:p>
-    <w:p>
-      <w:r>
-        <w:t>Unsuccessful variants make ~2x more decisions per tick than successful variants. This suggests they encounter food-sensing situations far more frequently, engaging in constant food-directed micro-corrections. While they make more correct food-directed moves, this strategy consumes energy inefficiently and leads to early starvation. Successful variants use a different movement strategy with fewer food-sensing decisions, achieving better long-term survival.</w:t>
-      </w:r>
-    </w:p>
-    <w:p/>
-    <w:p>
-      <w:r>
         <w:drawing>
           <wp:inline xmlns:a="http://schemas.openxmlformats.org/drawingml/2006/main" xmlns:pic="http://schemas.openxmlformats.org/drawingml/2006/picture">
-            <wp:extent cx="5486400" cy="1446735"/>
+            <wp:extent cx="5486400" cy="3071721"/>
             <wp:docPr id="5" name="Picture 5"/>
             <wp:cNvGraphicFramePr>
               <a:graphicFrameLocks noChangeAspect="1"/>
@@ -1927,7 +2200,7 @@
                   <pic:spPr>
                     <a:xfrm>
                       <a:off x="0" y="0"/>
-                      <a:ext cx="5486400" cy="1446735"/>
+                      <a:ext cx="5486400" cy="3071721"/>
                     </a:xfrm>
                     <a:prstGeom prst="rect"/>
                   </pic:spPr>
@@ -1941,10 +2214,23 @@
     <w:p/>
     <w:p>
       <w:pPr>
+        <w:pStyle w:val="Heading2"/>
+      </w:pPr>
+      <w:r>
+        <w:t>3.4. Distance travelled</w:t>
+      </w:r>
+    </w:p>
+    <w:p>
+      <w:r>
+        <w:t>Distance travelled total and normalized per tick for lifespan differences. This reveals movement intensity. We compare movement patterns between successful and unsuccessful variants to understand how spatial exploration versus local exploitation correlates with fitness.</w:t>
+      </w:r>
+    </w:p>
+    <w:p>
+      <w:pPr>
         <w:pStyle w:val="Heading3"/>
       </w:pPr>
       <w:r>
-        <w:t>6. Total Distance Travelled: Unsuccessful vs Successful</w:t>
+        <w:t>3.4.1. Distance travelled absolute</w:t>
       </w:r>
     </w:p>
     <w:tbl>
@@ -2185,7 +2471,7 @@
     </w:tbl>
     <w:p>
       <w:r>
-        <w:t>Mann-Whitney U Test Results:</w:t>
+        <w:t>Kruskal-Wallis Test Results:</w:t>
       </w:r>
     </w:p>
     <w:tbl>
@@ -2227,7 +2513,7 @@
           </w:tcPr>
           <w:p>
             <w:r>
-              <w:t>Mann-Whitney U-statistic</w:t>
+              <w:t>H-statistic</w:t>
             </w:r>
           </w:p>
         </w:tc>
@@ -2237,7 +2523,7 @@
           </w:tcPr>
           <w:p>
             <w:r>
-              <w:t>48552314.5</w:t>
+              <w:t>3589.6</w:t>
             </w:r>
           </w:p>
         </w:tc>
@@ -2260,6 +2546,193 @@
           <w:p>
             <w:r>
               <w:t>0.0000e+00</w:t>
+            </w:r>
+          </w:p>
+        </w:tc>
+      </w:tr>
+    </w:tbl>
+    <w:p/>
+    <w:p>
+      <w:r>
+        <w:t>Dunn's Post-hoc Test Results (pairwise comparisons, Bonferroni-adjusted):</w:t>
+      </w:r>
+    </w:p>
+    <w:tbl>
+      <w:tblPr>
+        <w:tblStyle w:val="LightGrid-Accent1"/>
+        <w:tblW w:type="auto" w:w="0"/>
+        <w:tblLook w:firstColumn="1" w:firstRow="1" w:lastColumn="0" w:lastRow="0" w:noHBand="0" w:noVBand="1" w:val="04A0"/>
+      </w:tblPr>
+      <w:tblGrid>
+        <w:gridCol w:w="2160"/>
+        <w:gridCol w:w="2160"/>
+        <w:gridCol w:w="2160"/>
+        <w:gridCol w:w="2160"/>
+      </w:tblGrid>
+      <w:tr>
+        <w:tc>
+          <w:tcPr>
+            <w:tcW w:type="dxa" w:w="2160"/>
+          </w:tcPr>
+          <w:p>
+            <w:r>
+              <w:t>Comparison</w:t>
+            </w:r>
+          </w:p>
+        </w:tc>
+        <w:tc>
+          <w:tcPr>
+            <w:tcW w:type="dxa" w:w="2160"/>
+          </w:tcPr>
+          <w:p>
+            <w:r>
+              <w:t>Hard-wired Lookup</w:t>
+            </w:r>
+          </w:p>
+        </w:tc>
+        <w:tc>
+          <w:tcPr>
+            <w:tcW w:type="dxa" w:w="2160"/>
+          </w:tcPr>
+          <w:p>
+            <w:r>
+              <w:t>Successful</w:t>
+            </w:r>
+          </w:p>
+        </w:tc>
+        <w:tc>
+          <w:tcPr>
+            <w:tcW w:type="dxa" w:w="2160"/>
+          </w:tcPr>
+          <w:p>
+            <w:r>
+              <w:t>Unsuccessful</w:t>
+            </w:r>
+          </w:p>
+        </w:tc>
+      </w:tr>
+      <w:tr>
+        <w:tc>
+          <w:tcPr>
+            <w:tcW w:type="dxa" w:w="2160"/>
+          </w:tcPr>
+          <w:p>
+            <w:r>
+              <w:t>Hard-wired Lookup</w:t>
+            </w:r>
+          </w:p>
+        </w:tc>
+        <w:tc>
+          <w:tcPr>
+            <w:tcW w:type="dxa" w:w="2160"/>
+          </w:tcPr>
+          <w:p>
+            <w:r>
+              <w:t>1.0000</w:t>
+            </w:r>
+          </w:p>
+        </w:tc>
+        <w:tc>
+          <w:tcPr>
+            <w:tcW w:type="dxa" w:w="2160"/>
+          </w:tcPr>
+          <w:p>
+            <w:r>
+              <w:t>0.0000</w:t>
+            </w:r>
+          </w:p>
+        </w:tc>
+        <w:tc>
+          <w:tcPr>
+            <w:tcW w:type="dxa" w:w="2160"/>
+          </w:tcPr>
+          <w:p>
+            <w:r>
+              <w:t>0.0000</w:t>
+            </w:r>
+          </w:p>
+        </w:tc>
+      </w:tr>
+      <w:tr>
+        <w:tc>
+          <w:tcPr>
+            <w:tcW w:type="dxa" w:w="2160"/>
+          </w:tcPr>
+          <w:p>
+            <w:r>
+              <w:t>Successful</w:t>
+            </w:r>
+          </w:p>
+        </w:tc>
+        <w:tc>
+          <w:tcPr>
+            <w:tcW w:type="dxa" w:w="2160"/>
+          </w:tcPr>
+          <w:p>
+            <w:r>
+              <w:t>0.0000</w:t>
+            </w:r>
+          </w:p>
+        </w:tc>
+        <w:tc>
+          <w:tcPr>
+            <w:tcW w:type="dxa" w:w="2160"/>
+          </w:tcPr>
+          <w:p>
+            <w:r>
+              <w:t>1.0000</w:t>
+            </w:r>
+          </w:p>
+        </w:tc>
+        <w:tc>
+          <w:tcPr>
+            <w:tcW w:type="dxa" w:w="2160"/>
+          </w:tcPr>
+          <w:p>
+            <w:r>
+              <w:t>0.0000</w:t>
+            </w:r>
+          </w:p>
+        </w:tc>
+      </w:tr>
+      <w:tr>
+        <w:tc>
+          <w:tcPr>
+            <w:tcW w:type="dxa" w:w="2160"/>
+          </w:tcPr>
+          <w:p>
+            <w:r>
+              <w:t>Unsuccessful</w:t>
+            </w:r>
+          </w:p>
+        </w:tc>
+        <w:tc>
+          <w:tcPr>
+            <w:tcW w:type="dxa" w:w="2160"/>
+          </w:tcPr>
+          <w:p>
+            <w:r>
+              <w:t>0.0000</w:t>
+            </w:r>
+          </w:p>
+        </w:tc>
+        <w:tc>
+          <w:tcPr>
+            <w:tcW w:type="dxa" w:w="2160"/>
+          </w:tcPr>
+          <w:p>
+            <w:r>
+              <w:t>0.0000</w:t>
+            </w:r>
+          </w:p>
+        </w:tc>
+        <w:tc>
+          <w:tcPr>
+            <w:tcW w:type="dxa" w:w="2160"/>
+          </w:tcPr>
+          <w:p>
+            <w:r>
+              <w:t>1.0000</w:t>
             </w:r>
           </w:p>
         </w:tc>
@@ -2269,7 +2742,7 @@
       <w:r>
         <w:drawing>
           <wp:inline xmlns:a="http://schemas.openxmlformats.org/drawingml/2006/main" xmlns:pic="http://schemas.openxmlformats.org/drawingml/2006/picture">
-            <wp:extent cx="5486400" cy="4358072"/>
+            <wp:extent cx="5486400" cy="3610547"/>
             <wp:docPr id="6" name="Picture 6"/>
             <wp:cNvGraphicFramePr>
               <a:graphicFrameLocks noChangeAspect="1"/>
@@ -2290,7 +2763,7 @@
                   <pic:spPr>
                     <a:xfrm>
                       <a:off x="0" y="0"/>
-                      <a:ext cx="5486400" cy="4358072"/>
+                      <a:ext cx="5486400" cy="3610547"/>
                     </a:xfrm>
                     <a:prstGeom prst="rect"/>
                   </pic:spPr>
@@ -2307,7 +2780,7 @@
         <w:pStyle w:val="Heading3"/>
       </w:pPr>
       <w:r>
-        <w:t>7. Distance Efficiency (Per Tick): Unsuccessful vs Successful</w:t>
+        <w:t>3.4.2. Distance travelled per tick</w:t>
       </w:r>
     </w:p>
     <w:tbl>
@@ -2548,7 +3021,7 @@
     </w:tbl>
     <w:p>
       <w:r>
-        <w:t>Mann-Whitney U Test Results:</w:t>
+        <w:t>Kruskal-Wallis Test Results:</w:t>
       </w:r>
     </w:p>
     <w:tbl>
@@ -2590,7 +3063,7 @@
           </w:tcPr>
           <w:p>
             <w:r>
-              <w:t>Mann-Whitney U-statistic</w:t>
+              <w:t>H-statistic</w:t>
             </w:r>
           </w:p>
         </w:tc>
@@ -2600,7 +3073,7 @@
           </w:tcPr>
           <w:p>
             <w:r>
-              <w:t>157277054.5</w:t>
+              <w:t>18248.2</w:t>
             </w:r>
           </w:p>
         </w:tc>
@@ -2623,6 +3096,193 @@
           <w:p>
             <w:r>
               <w:t>0.0000e+00</w:t>
+            </w:r>
+          </w:p>
+        </w:tc>
+      </w:tr>
+    </w:tbl>
+    <w:p/>
+    <w:p>
+      <w:r>
+        <w:t>Dunn's Post-hoc Test Results (pairwise comparisons, Bonferroni-adjusted):</w:t>
+      </w:r>
+    </w:p>
+    <w:tbl>
+      <w:tblPr>
+        <w:tblStyle w:val="LightGrid-Accent1"/>
+        <w:tblW w:type="auto" w:w="0"/>
+        <w:tblLook w:firstColumn="1" w:firstRow="1" w:lastColumn="0" w:lastRow="0" w:noHBand="0" w:noVBand="1" w:val="04A0"/>
+      </w:tblPr>
+      <w:tblGrid>
+        <w:gridCol w:w="2160"/>
+        <w:gridCol w:w="2160"/>
+        <w:gridCol w:w="2160"/>
+        <w:gridCol w:w="2160"/>
+      </w:tblGrid>
+      <w:tr>
+        <w:tc>
+          <w:tcPr>
+            <w:tcW w:type="dxa" w:w="2160"/>
+          </w:tcPr>
+          <w:p>
+            <w:r>
+              <w:t>Comparison</w:t>
+            </w:r>
+          </w:p>
+        </w:tc>
+        <w:tc>
+          <w:tcPr>
+            <w:tcW w:type="dxa" w:w="2160"/>
+          </w:tcPr>
+          <w:p>
+            <w:r>
+              <w:t>Hard-wired Lookup</w:t>
+            </w:r>
+          </w:p>
+        </w:tc>
+        <w:tc>
+          <w:tcPr>
+            <w:tcW w:type="dxa" w:w="2160"/>
+          </w:tcPr>
+          <w:p>
+            <w:r>
+              <w:t>Successful</w:t>
+            </w:r>
+          </w:p>
+        </w:tc>
+        <w:tc>
+          <w:tcPr>
+            <w:tcW w:type="dxa" w:w="2160"/>
+          </w:tcPr>
+          <w:p>
+            <w:r>
+              <w:t>Unsuccessful</w:t>
+            </w:r>
+          </w:p>
+        </w:tc>
+      </w:tr>
+      <w:tr>
+        <w:tc>
+          <w:tcPr>
+            <w:tcW w:type="dxa" w:w="2160"/>
+          </w:tcPr>
+          <w:p>
+            <w:r>
+              <w:t>Hard-wired Lookup</w:t>
+            </w:r>
+          </w:p>
+        </w:tc>
+        <w:tc>
+          <w:tcPr>
+            <w:tcW w:type="dxa" w:w="2160"/>
+          </w:tcPr>
+          <w:p>
+            <w:r>
+              <w:t>1.0000</w:t>
+            </w:r>
+          </w:p>
+        </w:tc>
+        <w:tc>
+          <w:tcPr>
+            <w:tcW w:type="dxa" w:w="2160"/>
+          </w:tcPr>
+          <w:p>
+            <w:r>
+              <w:t>0.0000</w:t>
+            </w:r>
+          </w:p>
+        </w:tc>
+        <w:tc>
+          <w:tcPr>
+            <w:tcW w:type="dxa" w:w="2160"/>
+          </w:tcPr>
+          <w:p>
+            <w:r>
+              <w:t>0.0000</w:t>
+            </w:r>
+          </w:p>
+        </w:tc>
+      </w:tr>
+      <w:tr>
+        <w:tc>
+          <w:tcPr>
+            <w:tcW w:type="dxa" w:w="2160"/>
+          </w:tcPr>
+          <w:p>
+            <w:r>
+              <w:t>Successful</w:t>
+            </w:r>
+          </w:p>
+        </w:tc>
+        <w:tc>
+          <w:tcPr>
+            <w:tcW w:type="dxa" w:w="2160"/>
+          </w:tcPr>
+          <w:p>
+            <w:r>
+              <w:t>0.0000</w:t>
+            </w:r>
+          </w:p>
+        </w:tc>
+        <w:tc>
+          <w:tcPr>
+            <w:tcW w:type="dxa" w:w="2160"/>
+          </w:tcPr>
+          <w:p>
+            <w:r>
+              <w:t>1.0000</w:t>
+            </w:r>
+          </w:p>
+        </w:tc>
+        <w:tc>
+          <w:tcPr>
+            <w:tcW w:type="dxa" w:w="2160"/>
+          </w:tcPr>
+          <w:p>
+            <w:r>
+              <w:t>0.0000</w:t>
+            </w:r>
+          </w:p>
+        </w:tc>
+      </w:tr>
+      <w:tr>
+        <w:tc>
+          <w:tcPr>
+            <w:tcW w:type="dxa" w:w="2160"/>
+          </w:tcPr>
+          <w:p>
+            <w:r>
+              <w:t>Unsuccessful</w:t>
+            </w:r>
+          </w:p>
+        </w:tc>
+        <w:tc>
+          <w:tcPr>
+            <w:tcW w:type="dxa" w:w="2160"/>
+          </w:tcPr>
+          <w:p>
+            <w:r>
+              <w:t>0.0000</w:t>
+            </w:r>
+          </w:p>
+        </w:tc>
+        <w:tc>
+          <w:tcPr>
+            <w:tcW w:type="dxa" w:w="2160"/>
+          </w:tcPr>
+          <w:p>
+            <w:r>
+              <w:t>0.0000</w:t>
+            </w:r>
+          </w:p>
+        </w:tc>
+        <w:tc>
+          <w:tcPr>
+            <w:tcW w:type="dxa" w:w="2160"/>
+          </w:tcPr>
+          <w:p>
+            <w:r>
+              <w:t>1.0000</w:t>
             </w:r>
           </w:p>
         </w:tc>
@@ -2632,7 +3292,7 @@
       <w:r>
         <w:drawing>
           <wp:inline xmlns:a="http://schemas.openxmlformats.org/drawingml/2006/main" xmlns:pic="http://schemas.openxmlformats.org/drawingml/2006/picture">
-            <wp:extent cx="5486400" cy="4358072"/>
+            <wp:extent cx="5486400" cy="3610547"/>
             <wp:docPr id="7" name="Picture 7"/>
             <wp:cNvGraphicFramePr>
               <a:graphicFrameLocks noChangeAspect="1"/>
@@ -2653,7 +3313,7 @@
                   <pic:spPr>
                     <a:xfrm>
                       <a:off x="0" y="0"/>
-                      <a:ext cx="5486400" cy="4358072"/>
+                      <a:ext cx="5486400" cy="3610547"/>
                     </a:xfrm>
                     <a:prstGeom prst="rect"/>
                   </pic:spPr>
@@ -2667,10 +3327,23 @@
     <w:p/>
     <w:p>
       <w:pPr>
+        <w:pStyle w:val="Heading2"/>
+      </w:pPr>
+      <w:r>
+        <w:t>3.5. Food eaten</w:t>
+      </w:r>
+    </w:p>
+    <w:p>
+      <w:r>
+        <w:t>Food consumption is the ultimate solution of the task. The more food consumed, the longer the survival. Normalized per tick food consumption may be the metric most directly linked to survival fitness.</w:t>
+      </w:r>
+    </w:p>
+    <w:p>
+      <w:pPr>
         <w:pStyle w:val="Heading3"/>
       </w:pPr>
       <w:r>
-        <w:t>8. Total Food Eaten: Unsuccessful vs Successful</w:t>
+        <w:t>3.5.1. Food consumption absolute</w:t>
       </w:r>
     </w:p>
     <w:tbl>
@@ -2911,7 +3584,7 @@
     </w:tbl>
     <w:p>
       <w:r>
-        <w:t>Mann-Whitney U Test Results:</w:t>
+        <w:t>Kruskal-Wallis Test Results:</w:t>
       </w:r>
     </w:p>
     <w:tbl>
@@ -2953,7 +3626,7 @@
           </w:tcPr>
           <w:p>
             <w:r>
-              <w:t>Mann-Whitney U-statistic</w:t>
+              <w:t>H-statistic</w:t>
             </w:r>
           </w:p>
         </w:tc>
@@ -2963,7 +3636,7 @@
           </w:tcPr>
           <w:p>
             <w:r>
-              <w:t>14559927.5</w:t>
+              <w:t>14834.6</w:t>
             </w:r>
           </w:p>
         </w:tc>
@@ -2986,6 +3659,193 @@
           <w:p>
             <w:r>
               <w:t>0.0000e+00</w:t>
+            </w:r>
+          </w:p>
+        </w:tc>
+      </w:tr>
+    </w:tbl>
+    <w:p/>
+    <w:p>
+      <w:r>
+        <w:t>Dunn's Post-hoc Test Results (pairwise comparisons, Bonferroni-adjusted):</w:t>
+      </w:r>
+    </w:p>
+    <w:tbl>
+      <w:tblPr>
+        <w:tblStyle w:val="LightGrid-Accent1"/>
+        <w:tblW w:type="auto" w:w="0"/>
+        <w:tblLook w:firstColumn="1" w:firstRow="1" w:lastColumn="0" w:lastRow="0" w:noHBand="0" w:noVBand="1" w:val="04A0"/>
+      </w:tblPr>
+      <w:tblGrid>
+        <w:gridCol w:w="2160"/>
+        <w:gridCol w:w="2160"/>
+        <w:gridCol w:w="2160"/>
+        <w:gridCol w:w="2160"/>
+      </w:tblGrid>
+      <w:tr>
+        <w:tc>
+          <w:tcPr>
+            <w:tcW w:type="dxa" w:w="2160"/>
+          </w:tcPr>
+          <w:p>
+            <w:r>
+              <w:t>Comparison</w:t>
+            </w:r>
+          </w:p>
+        </w:tc>
+        <w:tc>
+          <w:tcPr>
+            <w:tcW w:type="dxa" w:w="2160"/>
+          </w:tcPr>
+          <w:p>
+            <w:r>
+              <w:t>Hard-wired Lookup</w:t>
+            </w:r>
+          </w:p>
+        </w:tc>
+        <w:tc>
+          <w:tcPr>
+            <w:tcW w:type="dxa" w:w="2160"/>
+          </w:tcPr>
+          <w:p>
+            <w:r>
+              <w:t>Successful</w:t>
+            </w:r>
+          </w:p>
+        </w:tc>
+        <w:tc>
+          <w:tcPr>
+            <w:tcW w:type="dxa" w:w="2160"/>
+          </w:tcPr>
+          <w:p>
+            <w:r>
+              <w:t>Unsuccessful</w:t>
+            </w:r>
+          </w:p>
+        </w:tc>
+      </w:tr>
+      <w:tr>
+        <w:tc>
+          <w:tcPr>
+            <w:tcW w:type="dxa" w:w="2160"/>
+          </w:tcPr>
+          <w:p>
+            <w:r>
+              <w:t>Hard-wired Lookup</w:t>
+            </w:r>
+          </w:p>
+        </w:tc>
+        <w:tc>
+          <w:tcPr>
+            <w:tcW w:type="dxa" w:w="2160"/>
+          </w:tcPr>
+          <w:p>
+            <w:r>
+              <w:t>1.0000</w:t>
+            </w:r>
+          </w:p>
+        </w:tc>
+        <w:tc>
+          <w:tcPr>
+            <w:tcW w:type="dxa" w:w="2160"/>
+          </w:tcPr>
+          <w:p>
+            <w:r>
+              <w:t>0.0000</w:t>
+            </w:r>
+          </w:p>
+        </w:tc>
+        <w:tc>
+          <w:tcPr>
+            <w:tcW w:type="dxa" w:w="2160"/>
+          </w:tcPr>
+          <w:p>
+            <w:r>
+              <w:t>0.0000</w:t>
+            </w:r>
+          </w:p>
+        </w:tc>
+      </w:tr>
+      <w:tr>
+        <w:tc>
+          <w:tcPr>
+            <w:tcW w:type="dxa" w:w="2160"/>
+          </w:tcPr>
+          <w:p>
+            <w:r>
+              <w:t>Successful</w:t>
+            </w:r>
+          </w:p>
+        </w:tc>
+        <w:tc>
+          <w:tcPr>
+            <w:tcW w:type="dxa" w:w="2160"/>
+          </w:tcPr>
+          <w:p>
+            <w:r>
+              <w:t>0.0000</w:t>
+            </w:r>
+          </w:p>
+        </w:tc>
+        <w:tc>
+          <w:tcPr>
+            <w:tcW w:type="dxa" w:w="2160"/>
+          </w:tcPr>
+          <w:p>
+            <w:r>
+              <w:t>1.0000</w:t>
+            </w:r>
+          </w:p>
+        </w:tc>
+        <w:tc>
+          <w:tcPr>
+            <w:tcW w:type="dxa" w:w="2160"/>
+          </w:tcPr>
+          <w:p>
+            <w:r>
+              <w:t>0.0000</w:t>
+            </w:r>
+          </w:p>
+        </w:tc>
+      </w:tr>
+      <w:tr>
+        <w:tc>
+          <w:tcPr>
+            <w:tcW w:type="dxa" w:w="2160"/>
+          </w:tcPr>
+          <w:p>
+            <w:r>
+              <w:t>Unsuccessful</w:t>
+            </w:r>
+          </w:p>
+        </w:tc>
+        <w:tc>
+          <w:tcPr>
+            <w:tcW w:type="dxa" w:w="2160"/>
+          </w:tcPr>
+          <w:p>
+            <w:r>
+              <w:t>0.0000</w:t>
+            </w:r>
+          </w:p>
+        </w:tc>
+        <w:tc>
+          <w:tcPr>
+            <w:tcW w:type="dxa" w:w="2160"/>
+          </w:tcPr>
+          <w:p>
+            <w:r>
+              <w:t>0.0000</w:t>
+            </w:r>
+          </w:p>
+        </w:tc>
+        <w:tc>
+          <w:tcPr>
+            <w:tcW w:type="dxa" w:w="2160"/>
+          </w:tcPr>
+          <w:p>
+            <w:r>
+              <w:t>1.0000</w:t>
             </w:r>
           </w:p>
         </w:tc>
@@ -2995,7 +3855,7 @@
       <w:r>
         <w:drawing>
           <wp:inline xmlns:a="http://schemas.openxmlformats.org/drawingml/2006/main" xmlns:pic="http://schemas.openxmlformats.org/drawingml/2006/picture">
-            <wp:extent cx="5486400" cy="4358072"/>
+            <wp:extent cx="5486400" cy="3610547"/>
             <wp:docPr id="8" name="Picture 8"/>
             <wp:cNvGraphicFramePr>
               <a:graphicFrameLocks noChangeAspect="1"/>
@@ -3016,7 +3876,7 @@
                   <pic:spPr>
                     <a:xfrm>
                       <a:off x="0" y="0"/>
-                      <a:ext cx="5486400" cy="4358072"/>
+                      <a:ext cx="5486400" cy="3610547"/>
                     </a:xfrm>
                     <a:prstGeom prst="rect"/>
                   </pic:spPr>
@@ -3033,7 +3893,7 @@
         <w:pStyle w:val="Heading3"/>
       </w:pPr>
       <w:r>
-        <w:t>9. Food Consumption Rate (Per Tick): Unsuccessful vs Successful</w:t>
+        <w:t>3.5.2. Food consumption per tick</w:t>
       </w:r>
     </w:p>
     <w:tbl>
@@ -3274,7 +4134,7 @@
     </w:tbl>
     <w:p>
       <w:r>
-        <w:t>Mann-Whitney U Test Results:</w:t>
+        <w:t>Kruskal-Wallis Test Results:</w:t>
       </w:r>
     </w:p>
     <w:tbl>
@@ -3316,7 +4176,7 @@
           </w:tcPr>
           <w:p>
             <w:r>
-              <w:t>Mann-Whitney U-statistic</w:t>
+              <w:t>H-statistic</w:t>
             </w:r>
           </w:p>
         </w:tc>
@@ -3326,7 +4186,7 @@
           </w:tcPr>
           <w:p>
             <w:r>
-              <w:t>15978329.0</w:t>
+              <w:t>14231.2</w:t>
             </w:r>
           </w:p>
         </w:tc>
@@ -3349,6 +4209,193 @@
           <w:p>
             <w:r>
               <w:t>0.0000e+00</w:t>
+            </w:r>
+          </w:p>
+        </w:tc>
+      </w:tr>
+    </w:tbl>
+    <w:p/>
+    <w:p>
+      <w:r>
+        <w:t>Dunn's Post-hoc Test Results (pairwise comparisons, Bonferroni-adjusted):</w:t>
+      </w:r>
+    </w:p>
+    <w:tbl>
+      <w:tblPr>
+        <w:tblStyle w:val="LightGrid-Accent1"/>
+        <w:tblW w:type="auto" w:w="0"/>
+        <w:tblLook w:firstColumn="1" w:firstRow="1" w:lastColumn="0" w:lastRow="0" w:noHBand="0" w:noVBand="1" w:val="04A0"/>
+      </w:tblPr>
+      <w:tblGrid>
+        <w:gridCol w:w="2160"/>
+        <w:gridCol w:w="2160"/>
+        <w:gridCol w:w="2160"/>
+        <w:gridCol w:w="2160"/>
+      </w:tblGrid>
+      <w:tr>
+        <w:tc>
+          <w:tcPr>
+            <w:tcW w:type="dxa" w:w="2160"/>
+          </w:tcPr>
+          <w:p>
+            <w:r>
+              <w:t>Comparison</w:t>
+            </w:r>
+          </w:p>
+        </w:tc>
+        <w:tc>
+          <w:tcPr>
+            <w:tcW w:type="dxa" w:w="2160"/>
+          </w:tcPr>
+          <w:p>
+            <w:r>
+              <w:t>Hard-wired Lookup</w:t>
+            </w:r>
+          </w:p>
+        </w:tc>
+        <w:tc>
+          <w:tcPr>
+            <w:tcW w:type="dxa" w:w="2160"/>
+          </w:tcPr>
+          <w:p>
+            <w:r>
+              <w:t>Successful</w:t>
+            </w:r>
+          </w:p>
+        </w:tc>
+        <w:tc>
+          <w:tcPr>
+            <w:tcW w:type="dxa" w:w="2160"/>
+          </w:tcPr>
+          <w:p>
+            <w:r>
+              <w:t>Unsuccessful</w:t>
+            </w:r>
+          </w:p>
+        </w:tc>
+      </w:tr>
+      <w:tr>
+        <w:tc>
+          <w:tcPr>
+            <w:tcW w:type="dxa" w:w="2160"/>
+          </w:tcPr>
+          <w:p>
+            <w:r>
+              <w:t>Hard-wired Lookup</w:t>
+            </w:r>
+          </w:p>
+        </w:tc>
+        <w:tc>
+          <w:tcPr>
+            <w:tcW w:type="dxa" w:w="2160"/>
+          </w:tcPr>
+          <w:p>
+            <w:r>
+              <w:t>1.0000</w:t>
+            </w:r>
+          </w:p>
+        </w:tc>
+        <w:tc>
+          <w:tcPr>
+            <w:tcW w:type="dxa" w:w="2160"/>
+          </w:tcPr>
+          <w:p>
+            <w:r>
+              <w:t>0.0000</w:t>
+            </w:r>
+          </w:p>
+        </w:tc>
+        <w:tc>
+          <w:tcPr>
+            <w:tcW w:type="dxa" w:w="2160"/>
+          </w:tcPr>
+          <w:p>
+            <w:r>
+              <w:t>0.0000</w:t>
+            </w:r>
+          </w:p>
+        </w:tc>
+      </w:tr>
+      <w:tr>
+        <w:tc>
+          <w:tcPr>
+            <w:tcW w:type="dxa" w:w="2160"/>
+          </w:tcPr>
+          <w:p>
+            <w:r>
+              <w:t>Successful</w:t>
+            </w:r>
+          </w:p>
+        </w:tc>
+        <w:tc>
+          <w:tcPr>
+            <w:tcW w:type="dxa" w:w="2160"/>
+          </w:tcPr>
+          <w:p>
+            <w:r>
+              <w:t>0.0000</w:t>
+            </w:r>
+          </w:p>
+        </w:tc>
+        <w:tc>
+          <w:tcPr>
+            <w:tcW w:type="dxa" w:w="2160"/>
+          </w:tcPr>
+          <w:p>
+            <w:r>
+              <w:t>1.0000</w:t>
+            </w:r>
+          </w:p>
+        </w:tc>
+        <w:tc>
+          <w:tcPr>
+            <w:tcW w:type="dxa" w:w="2160"/>
+          </w:tcPr>
+          <w:p>
+            <w:r>
+              <w:t>0.0000</w:t>
+            </w:r>
+          </w:p>
+        </w:tc>
+      </w:tr>
+      <w:tr>
+        <w:tc>
+          <w:tcPr>
+            <w:tcW w:type="dxa" w:w="2160"/>
+          </w:tcPr>
+          <w:p>
+            <w:r>
+              <w:t>Unsuccessful</w:t>
+            </w:r>
+          </w:p>
+        </w:tc>
+        <w:tc>
+          <w:tcPr>
+            <w:tcW w:type="dxa" w:w="2160"/>
+          </w:tcPr>
+          <w:p>
+            <w:r>
+              <w:t>0.0000</w:t>
+            </w:r>
+          </w:p>
+        </w:tc>
+        <w:tc>
+          <w:tcPr>
+            <w:tcW w:type="dxa" w:w="2160"/>
+          </w:tcPr>
+          <w:p>
+            <w:r>
+              <w:t>0.0000</w:t>
+            </w:r>
+          </w:p>
+        </w:tc>
+        <w:tc>
+          <w:tcPr>
+            <w:tcW w:type="dxa" w:w="2160"/>
+          </w:tcPr>
+          <w:p>
+            <w:r>
+              <w:t>1.0000</w:t>
             </w:r>
           </w:p>
         </w:tc>
@@ -3358,7 +4405,7 @@
       <w:r>
         <w:drawing>
           <wp:inline xmlns:a="http://schemas.openxmlformats.org/drawingml/2006/main" xmlns:pic="http://schemas.openxmlformats.org/drawingml/2006/picture">
-            <wp:extent cx="5486400" cy="4358072"/>
+            <wp:extent cx="5486400" cy="3610547"/>
             <wp:docPr id="9" name="Picture 9"/>
             <wp:cNvGraphicFramePr>
               <a:graphicFrameLocks noChangeAspect="1"/>
@@ -3379,7 +4426,7 @@
                   <pic:spPr>
                     <a:xfrm>
                       <a:off x="0" y="0"/>
-                      <a:ext cx="5486400" cy="4358072"/>
+                      <a:ext cx="5486400" cy="3610547"/>
                     </a:xfrm>
                     <a:prstGeom prst="rect"/>
                   </pic:spPr>

</xml_diff>